<commit_message>
fix(api): complete contract workbench live verification
</commit_message>
<xml_diff>
--- a/services/api/assets/templates/material-purchase-v1.docx
+++ b/services/api/assets/templates/material-purchase-v1.docx
@@ -9,32 +9,32 @@
     </w:p>
     <w:p>
       <w:r>
-        <w:t xml:space="preserve">合同名称：{{contract.name}}</w:t>
+        <w:t xml:space="preserve">合同名称：{contract.name}</w:t>
       </w:r>
     </w:p>
     <w:p>
       <w:r>
-        <w:t xml:space="preserve">临时编号：{{contract.temporaryCode}}</w:t>
+        <w:t xml:space="preserve">临时编号：{contract.temporaryCode}</w:t>
       </w:r>
     </w:p>
     <w:p>
       <w:r>
-        <w:t xml:space="preserve">合同金额大写：{{contract.amountUppercase}}</w:t>
+        <w:t xml:space="preserve">合同金额大写：{contract.amountUppercase}</w:t>
       </w:r>
     </w:p>
     <w:p>
       <w:r>
-        <w:t xml:space="preserve">交货地点：{{field.deliveryLocation}}</w:t>
+        <w:t xml:space="preserve">交货地点：{field.deliveryLocation}</w:t>
       </w:r>
     </w:p>
     <w:p>
       <w:r>
-        <w:t xml:space="preserve">付款条款：{{clause.payment.text}}</w:t>
+        <w:t xml:space="preserve">付款条款：{clause.payment.text}</w:t>
       </w:r>
     </w:p>
     <w:p>
       <w:r>
-        <w:t xml:space="preserve">水印：{{document.watermark}}</w:t>
+        <w:t xml:space="preserve">水印：{document.watermark}</w:t>
       </w:r>
     </w:p>
     <w:p>

</xml_diff>